<commit_message>
docs: repoint brand asset references after the gateway removal
Commit 052ca7e removed the .claude gateway and developer-handbook and noted
that four files under doc/ were left with dangling .claude paths. This fixes
those four.

The references now point at doc/design-system/assets/, which is where the
assets landed, and record that the application vendors its own copies under
resources/images/brand/ (Vite-managed, fingerprinted) and public/brand/
(favicons, stable URL). The app therefore has no runtime dependency on a
documentation path, which is what makes the earlier BRAND_ASSETS_PATH question
moot rather than merely relocated.

Word versions regenerated for the three changed documents.

Co-Authored-By: Claude Opus 5 <noreply@anthropic.com>
Claude-Session: https://claude.ai/code/session_012MjRrKysSghaXvvmZAStaL
</commit_message>
<xml_diff>
--- a/doc/word/00-Solution-Architecture.docx
+++ b/doc/word/00-Solution-Architecture.docx
@@ -4725,10 +4725,10 @@
         <w:rPr>
           <w:b/>
         </w:rPr>
-        <w:t>resolved: present on `DEV`</w:t>
+        <w:t>resolved.</w:t>
       </w:r>
       <w:r>
-        <w:t xml:space="preserve"> at</w:t>
+        <w:t xml:space="preserve"> The assets now live at</w:t>
       </w:r>
     </w:p>
     <w:p>
@@ -4736,19 +4736,10 @@
         <w:rPr>
           <w:rFonts w:ascii="Consolas" w:hAnsi="Consolas"/>
         </w:rPr>
-        <w:t>.claude/skills/ui-ux-design/assets/</w:t>
+        <w:t>doc/design-system/assets/</w:t>
       </w:r>
       <w:r>
-        <w:t xml:space="preserve">. Still needed: which copy is authoritative (a second set exists under </w:t>
-      </w:r>
-      <w:r>
-        <w:rPr>
-          <w:rFonts w:ascii="Consolas" w:hAnsi="Consolas"/>
-        </w:rPr>
-        <w:t>developer-handbook/layout-template/assets/images/</w:t>
-      </w:r>
-      <w:r>
-        <w:t>) and the</w:t>
+        <w:t>, and the application vendors its own copies at</w:t>
       </w:r>
     </w:p>
     <w:p>
@@ -4756,10 +4747,19 @@
         <w:rPr>
           <w:rFonts w:ascii="Consolas" w:hAnsi="Consolas"/>
         </w:rPr>
-        <w:t>&lt;BRAND_ASSETS_PATH&gt;</w:t>
+        <w:t>resources/images/brand/</w:t>
       </w:r>
       <w:r>
-        <w:t xml:space="preserve"> the application installs them to. 3. Confirmation of the five role labels in section 7. 4. Whether a single Entra app registration is used for all customer tenants (multi-tenant) or one per customer. 5. Whether pilot customers already hold F2+ capacity, or SemantIQ must provision it.</w:t>
+        <w:t xml:space="preserve"> (Vite-managed, fingerprinted) and </w:t>
+      </w:r>
+      <w:r>
+        <w:rPr>
+          <w:rFonts w:ascii="Consolas" w:hAnsi="Consolas"/>
+        </w:rPr>
+        <w:t>public/brand/</w:t>
+      </w:r>
+      <w:r>
+        <w:t xml:space="preserve"> (favicons, stable URL), so the app no longer depends on a documentation path. 3. Confirmation of the five role labels in section 7. 4. Whether a single Entra app registration is used for all customer tenants (multi-tenant) or one per customer. 5. Whether pilot customers already hold F2+ capacity, or SemantIQ must provision it.</w:t>
       </w:r>
     </w:p>
     <w:p>

</xml_diff>